<commit_message>
Update Lab 03 with Tailwind 12-column grid
</commit_message>
<xml_diff>
--- a/Labs/04/Lab 04.docx
+++ b/Labs/04/Lab 04.docx
@@ -2714,13 +2714,8 @@
         </w:rPr>
         <w:tab/>
       </w:r>
-      <w:proofErr w:type="gramStart"/>
-      <w:r>
-        <w:t>In</w:t>
-      </w:r>
-      <w:proofErr w:type="gramEnd"/>
-      <w:r>
-        <w:t xml:space="preserve"> CSS and HTML, the Box Model refers to the concept of a rectangular box that wraps around every HTML element on a web page, such as text, images, and other elements. The box is made up of four parts: content, padding, border, and margin. </w:t>
+      <w:r>
+        <w:t xml:space="preserve">In CSS and HTML, the Box Model refers to the concept of a rectangular box that wraps around every HTML element on a web page, such as text, images, and other elements. The box is made up of four parts: content, padding, border, and margin. </w:t>
       </w:r>
     </w:p>
     <w:p>
@@ -2903,25 +2898,62 @@
           <w:i/>
           <w:color w:val="1F4D78"/>
         </w:rPr>
-        <w:t>@media screen and (</w:t>
-      </w:r>
-      <w:proofErr w:type="gramStart"/>
+        <w:t xml:space="preserve">@media screen and (max-width: 768px) { </w:t>
+      </w:r>
+    </w:p>
+    <w:p>
+      <w:pPr>
+        <w:spacing w:after="18" w:line="259" w:lineRule="auto"/>
+        <w:ind w:left="2354" w:right="0"/>
+      </w:pPr>
       <w:r>
         <w:rPr>
           <w:rFonts w:ascii="Calibri" w:eastAsia="Calibri" w:hAnsi="Calibri" w:cs="Calibri"/>
           <w:i/>
           <w:color w:val="1F4D78"/>
         </w:rPr>
-        <w:t>max-width</w:t>
-      </w:r>
-      <w:proofErr w:type="gramEnd"/>
+        <w:t xml:space="preserve">  /* CSS styles go here */ </w:t>
+      </w:r>
+    </w:p>
+    <w:p>
+      <w:pPr>
+        <w:spacing w:after="18" w:line="259" w:lineRule="auto"/>
+        <w:ind w:left="2354" w:right="0"/>
+      </w:pPr>
       <w:r>
         <w:rPr>
           <w:rFonts w:ascii="Calibri" w:eastAsia="Calibri" w:hAnsi="Calibri" w:cs="Calibri"/>
           <w:i/>
           <w:color w:val="1F4D78"/>
         </w:rPr>
-        <w:t xml:space="preserve">: 768px) { </w:t>
+        <w:t xml:space="preserve">} </w:t>
+      </w:r>
+    </w:p>
+    <w:p>
+      <w:pPr>
+        <w:spacing w:after="0" w:line="259" w:lineRule="auto"/>
+        <w:ind w:left="2359" w:right="0" w:firstLine="0"/>
+      </w:pPr>
+      <w:r>
+        <w:t xml:space="preserve"> </w:t>
+      </w:r>
+    </w:p>
+    <w:p>
+      <w:pPr>
+        <w:ind w:left="2354" w:right="298"/>
+      </w:pPr>
+      <w:r>
+        <w:lastRenderedPageBreak/>
+        <w:t xml:space="preserve">In this example, the media query applies styles only when the screen width is 768 pixels or less. You can also use min-width to apply styles only when the screen width is greater than a certain value. Media queries can also be used for other conditions, such as device orientation, screen resolution, and more. For example: </w:t>
+      </w:r>
+    </w:p>
+    <w:p>
+      <w:pPr>
+        <w:spacing w:after="21" w:line="259" w:lineRule="auto"/>
+        <w:ind w:left="2359" w:right="0" w:firstLine="0"/>
+      </w:pPr>
+      <w:r>
+        <w:t xml:space="preserve"> </w:t>
       </w:r>
     </w:p>
     <w:p>
@@ -2935,98 +2967,7 @@
           <w:i/>
           <w:color w:val="1F4D78"/>
         </w:rPr>
-        <w:t xml:space="preserve">  /* CSS styles go here */ </w:t>
-      </w:r>
-    </w:p>
-    <w:p>
-      <w:pPr>
-        <w:spacing w:after="18" w:line="259" w:lineRule="auto"/>
-        <w:ind w:left="2354" w:right="0"/>
-      </w:pPr>
-      <w:r>
-        <w:rPr>
-          <w:rFonts w:ascii="Calibri" w:eastAsia="Calibri" w:hAnsi="Calibri" w:cs="Calibri"/>
-          <w:i/>
-          <w:color w:val="1F4D78"/>
-        </w:rPr>
-        <w:t xml:space="preserve">} </w:t>
-      </w:r>
-    </w:p>
-    <w:p>
-      <w:pPr>
-        <w:spacing w:after="0" w:line="259" w:lineRule="auto"/>
-        <w:ind w:left="2359" w:right="0" w:firstLine="0"/>
-      </w:pPr>
-      <w:r>
-        <w:t xml:space="preserve"> </w:t>
-      </w:r>
-    </w:p>
-    <w:p>
-      <w:pPr>
-        <w:ind w:left="2354" w:right="298"/>
-      </w:pPr>
-      <w:r>
-        <w:lastRenderedPageBreak/>
-        <w:t xml:space="preserve">In this example, the media query </w:t>
-      </w:r>
-      <w:proofErr w:type="gramStart"/>
-      <w:r>
-        <w:t>applies</w:t>
-      </w:r>
-      <w:proofErr w:type="gramEnd"/>
-      <w:r>
-        <w:t xml:space="preserve"> styles only when the screen width is 768 pixels or less. You can also use min-width to apply styles only when the screen width is greater than a certain value. Media queries can also be used for other conditions, such as device orientation, screen resolution, and more. For example: </w:t>
-      </w:r>
-    </w:p>
-    <w:p>
-      <w:pPr>
-        <w:spacing w:after="21" w:line="259" w:lineRule="auto"/>
-        <w:ind w:left="2359" w:right="0" w:firstLine="0"/>
-      </w:pPr>
-      <w:r>
-        <w:t xml:space="preserve"> </w:t>
-      </w:r>
-    </w:p>
-    <w:p>
-      <w:pPr>
-        <w:spacing w:after="18" w:line="259" w:lineRule="auto"/>
-        <w:ind w:left="2354" w:right="0"/>
-      </w:pPr>
-      <w:proofErr w:type="gramStart"/>
-      <w:r>
-        <w:rPr>
-          <w:rFonts w:ascii="Calibri" w:eastAsia="Calibri" w:hAnsi="Calibri" w:cs="Calibri"/>
-          <w:i/>
-          <w:color w:val="1F4D78"/>
-        </w:rPr>
-        <w:t>@media</w:t>
-      </w:r>
-      <w:proofErr w:type="gramEnd"/>
-      <w:r>
-        <w:rPr>
-          <w:rFonts w:ascii="Calibri" w:eastAsia="Calibri" w:hAnsi="Calibri" w:cs="Calibri"/>
-          <w:i/>
-          <w:color w:val="1F4D78"/>
-        </w:rPr>
-        <w:t xml:space="preserve"> (orientation: </w:t>
-      </w:r>
-      <w:proofErr w:type="gramStart"/>
-      <w:r>
-        <w:rPr>
-          <w:rFonts w:ascii="Calibri" w:eastAsia="Calibri" w:hAnsi="Calibri" w:cs="Calibri"/>
-          <w:i/>
-          <w:color w:val="1F4D78"/>
-        </w:rPr>
-        <w:t>landscape) {</w:t>
-      </w:r>
-      <w:proofErr w:type="gramEnd"/>
-      <w:r>
-        <w:rPr>
-          <w:rFonts w:ascii="Calibri" w:eastAsia="Calibri" w:hAnsi="Calibri" w:cs="Calibri"/>
-          <w:i/>
-          <w:color w:val="1F4D78"/>
-        </w:rPr>
-        <w:t xml:space="preserve"> </w:t>
+        <w:t xml:space="preserve">@media (orientation: landscape) { </w:t>
       </w:r>
     </w:p>
     <w:p>
@@ -3746,7 +3687,6 @@
                 <w:rFonts w:ascii="Times New Roman" w:hAnsi="Times New Roman" w:cs="Times New Roman"/>
               </w:rPr>
             </w:pPr>
-            <w:proofErr w:type="gramStart"/>
             <w:r>
               <w:rPr>
                 <w:rFonts w:ascii="Times New Roman" w:hAnsi="Times New Roman" w:cs="Times New Roman"/>
@@ -3759,34 +3699,7 @@
                 <w:b/>
                 <w:bCs/>
               </w:rPr>
-              <w:t>:nth</w:t>
-            </w:r>
-            <w:proofErr w:type="gramEnd"/>
-            <w:r>
-              <w:rPr>
-                <w:rFonts w:ascii="Times New Roman" w:hAnsi="Times New Roman" w:cs="Times New Roman"/>
-                <w:b/>
-                <w:bCs/>
-              </w:rPr>
-              <w:t>-</w:t>
-            </w:r>
-            <w:proofErr w:type="gramStart"/>
-            <w:r>
-              <w:rPr>
-                <w:rFonts w:ascii="Times New Roman" w:hAnsi="Times New Roman" w:cs="Times New Roman"/>
-                <w:b/>
-                <w:bCs/>
-              </w:rPr>
-              <w:t>child(</w:t>
-            </w:r>
-            <w:proofErr w:type="gramEnd"/>
-            <w:r>
-              <w:rPr>
-                <w:rFonts w:ascii="Times New Roman" w:hAnsi="Times New Roman" w:cs="Times New Roman"/>
-                <w:b/>
-                <w:bCs/>
-              </w:rPr>
-              <w:t>)</w:t>
+              <w:t>:nth-child()</w:t>
             </w:r>
             <w:r>
               <w:rPr>
@@ -5316,47 +5229,13 @@
                 <w:sz w:val="21"/>
               </w:rPr>
             </w:pPr>
-            <w:proofErr w:type="gramStart"/>
             <w:r>
               <w:rPr>
                 <w:rFonts w:ascii="Times New Roman" w:hAnsi="Times New Roman" w:cs="Times New Roman"/>
                 <w:sz w:val="21"/>
               </w:rPr>
-              <w:t>[ Sidebar</w:t>
-            </w:r>
-            <w:proofErr w:type="gramEnd"/>
-            <w:r>
-              <w:rPr>
-                <w:rFonts w:ascii="Times New Roman" w:hAnsi="Times New Roman" w:cs="Times New Roman"/>
-                <w:sz w:val="21"/>
-              </w:rPr>
-              <w:t xml:space="preserve">: 4 </w:t>
-            </w:r>
-            <w:proofErr w:type="gramStart"/>
-            <w:r>
-              <w:rPr>
-                <w:rFonts w:ascii="Times New Roman" w:hAnsi="Times New Roman" w:cs="Times New Roman"/>
-                <w:sz w:val="21"/>
-              </w:rPr>
-              <w:t>columns ][ Main</w:t>
-            </w:r>
-            <w:proofErr w:type="gramEnd"/>
-            <w:r>
-              <w:rPr>
-                <w:rFonts w:ascii="Times New Roman" w:hAnsi="Times New Roman" w:cs="Times New Roman"/>
-                <w:sz w:val="21"/>
-              </w:rPr>
-              <w:t xml:space="preserve"> Content: 8 </w:t>
-            </w:r>
-            <w:proofErr w:type="gramStart"/>
-            <w:r>
-              <w:rPr>
-                <w:rFonts w:ascii="Times New Roman" w:hAnsi="Times New Roman" w:cs="Times New Roman"/>
-                <w:sz w:val="21"/>
-              </w:rPr>
-              <w:t>columns ]</w:t>
-            </w:r>
-            <w:proofErr w:type="gramEnd"/>
+              <w:t>[ Sidebar: 4 columns ][ Main Content: 8 columns ]</w:t>
+            </w:r>
           </w:p>
           <w:p>
             <w:pPr>
@@ -5430,12 +5309,51 @@
     </w:p>
     <w:p>
       <w:pPr>
-        <w:numPr>
-          <w:ilvl w:val="0"/>
-          <w:numId w:val="2"/>
-        </w:numPr>
-        <w:ind w:right="142" w:hanging="360"/>
-      </w:pPr>
+        <w:pStyle w:val="ListParagraph"/>
+        <w:shd w:val="clear" w:color="auto" w:fill="F6F8FA"/>
+        <w:wordWrap w:val="0"/>
+        <w:spacing w:after="0" w:line="300" w:lineRule="atLeast"/>
+        <w:ind w:right="0" w:firstLine="0"/>
+        <w:textAlignment w:val="center"/>
+        <w:rPr>
+          <w:rFonts w:ascii="Consolas" w:eastAsia="Times New Roman" w:hAnsi="Consolas" w:cs="Segoe UI"/>
+          <w:color w:val="59636E"/>
+          <w:kern w:val="0"/>
+          <w:sz w:val="18"/>
+          <w:szCs w:val="18"/>
+          <w14:ligatures w14:val="none"/>
+        </w:rPr>
+      </w:pPr>
+      <w:r>
+        <w:rPr>
+          <w:rFonts w:ascii="Consolas" w:eastAsia="Times New Roman" w:hAnsi="Consolas" w:cs="Segoe UI"/>
+          <w:color w:val="59636E"/>
+          <w:kern w:val="0"/>
+          <w:sz w:val="18"/>
+          <w:szCs w:val="18"/>
+          <w14:ligatures w14:val="none"/>
+        </w:rPr>
+        <w:t>_github-pages-challenge-MuhammadTahaD.taha.resume</w:t>
+      </w:r>
+      <w:r>
+        <w:rPr>
+          <w:rFonts w:ascii="Segoe UI" w:eastAsia="Times New Roman" w:hAnsi="Segoe UI" w:cs="Segoe UI"/>
+          <w:color w:val="1F2328"/>
+          <w:kern w:val="0"/>
+          <w:sz w:val="21"/>
+          <w:szCs w:val="21"/>
+          <w14:ligatures w14:val="none"/>
+        </w:rPr>
+        <w:t>.webapp.com</w:t>
+      </w:r>
+    </w:p>
+    <w:p>
+      <w:pPr>
+        <w:ind w:left="720" w:right="142" w:firstLine="0"/>
+      </w:pPr>
+      <w:r>
+        <w:t>https://github.com/MuhammadTahaD/Web-Engineering/tree/main/Labs/04</w:t>
+      </w:r>
     </w:p>
     <w:p>
       <w:pPr>
@@ -5461,6 +5379,9 @@
         <w:ind w:left="833" w:right="0" w:firstLine="0"/>
       </w:pPr>
       <w:r>
+        <w:rPr>
+          <w:noProof/>
+        </w:rPr>
         <w:drawing>
           <wp:inline distT="0" distB="0" distL="0" distR="0" wp14:anchorId="45D0F6DD" wp14:editId="05F4D14E">
             <wp:extent cx="5983605" cy="2786380"/>
@@ -5510,6 +5431,9 @@
         <w:ind w:left="833" w:right="0" w:firstLine="0"/>
       </w:pPr>
       <w:r>
+        <w:rPr>
+          <w:noProof/>
+        </w:rPr>
         <w:lastRenderedPageBreak/>
         <w:drawing>
           <wp:inline distT="0" distB="0" distL="0" distR="0" wp14:anchorId="14EDB860" wp14:editId="732A358A">
@@ -5560,6 +5484,9 @@
         <w:ind w:left="833" w:right="0" w:firstLine="0"/>
       </w:pPr>
       <w:r>
+        <w:rPr>
+          <w:noProof/>
+        </w:rPr>
         <w:drawing>
           <wp:inline distT="0" distB="0" distL="0" distR="0" wp14:anchorId="7E45D765" wp14:editId="7326E838">
             <wp:extent cx="5983605" cy="2787650"/>
@@ -5609,6 +5536,9 @@
         <w:ind w:left="833" w:right="0" w:firstLine="0"/>
       </w:pPr>
       <w:r>
+        <w:rPr>
+          <w:noProof/>
+        </w:rPr>
         <w:lastRenderedPageBreak/>
         <w:drawing>
           <wp:inline distT="0" distB="0" distL="0" distR="0" wp14:anchorId="7794D536" wp14:editId="10EA74C6">
@@ -5659,6 +5589,9 @@
         <w:ind w:left="833" w:right="0" w:firstLine="0"/>
       </w:pPr>
       <w:r>
+        <w:rPr>
+          <w:noProof/>
+        </w:rPr>
         <w:drawing>
           <wp:inline distT="0" distB="0" distL="0" distR="0" wp14:anchorId="7204540C" wp14:editId="0D9C0771">
             <wp:extent cx="5983605" cy="3784600"/>
@@ -7371,6 +7304,7 @@
   <w:style w:type="character" w:default="1" w:styleId="DefaultParagraphFont">
     <w:name w:val="Default Paragraph Font"/>
     <w:uiPriority w:val="1"/>
+    <w:semiHidden/>
     <w:unhideWhenUsed/>
   </w:style>
   <w:style w:type="table" w:default="1" w:styleId="TableNormal">
@@ -7417,6 +7351,22 @@
         <w:right w:w="0" w:type="dxa"/>
       </w:tblCellMar>
     </w:tblPr>
+  </w:style>
+  <w:style w:type="character" w:customStyle="1" w:styleId="css-truncate">
+    <w:name w:val="css-truncate"/>
+    <w:basedOn w:val="DefaultParagraphFont"/>
+    <w:rsid w:val="00434549"/>
+  </w:style>
+  <w:style w:type="paragraph" w:styleId="ListParagraph">
+    <w:name w:val="List Paragraph"/>
+    <w:basedOn w:val="Normal"/>
+    <w:uiPriority w:val="34"/>
+    <w:qFormat/>
+    <w:rsid w:val="00434549"/>
+    <w:pPr>
+      <w:ind w:left="720"/>
+      <w:contextualSpacing/>
+    </w:pPr>
   </w:style>
 </w:styles>
 </file>

</xml_diff>